<commit_message>
fix: atualização do docs
</commit_message>
<xml_diff>
--- a/docs/documento-semaforo-maria-laura.docx
+++ b/docs/documento-semaforo-maria-laura.docx
@@ -270,7 +270,6 @@
         </w:rPr>
         <w:t xml:space="preserve"> </w:t>
       </w:r>
-      <w:proofErr w:type="gramStart"/>
       <w:r>
         <w:rPr>
           <w:rFonts w:cs="Arial"/>
@@ -295,7 +294,6 @@
         </w:rPr>
         <w:t>.</w:t>
       </w:r>
-      <w:proofErr w:type="gramEnd"/>
       <w:r>
         <w:rPr>
           <w:rFonts w:cs="Arial"/>
@@ -3097,15 +3095,7 @@
         <w:t>No campo da segurança e lógica de tráfego, os requisitos funcionais estabelecem regras rígidas</w:t>
       </w:r>
       <w:r>
-        <w:t xml:space="preserve"> </w:t>
-      </w:r>
-      <w:proofErr w:type="gramStart"/>
-      <w:r>
-        <w:t>como :</w:t>
-      </w:r>
-      <w:proofErr w:type="gramEnd"/>
-      <w:r>
-        <w:t xml:space="preserve"> </w:t>
+        <w:t xml:space="preserve"> como : </w:t>
       </w:r>
       <w:r>
         <w:t>o sistema deve obrigatoriamente impedir que as duas vias fiquem verdes simultaneamente, evitando qualquer risco de colisão. Complementando essa segurança, o software deve processar tempos de permanência distintos para priorizar a via principal e executar intervalos de segurança onde ambos os sinais permaneçam no vermelho durante a transição de fluxo, garantindo que o cruzamento esteja vazio antes de cada liberação</w:t>
@@ -4483,9 +4473,8 @@
           <w:color w:val="4472C4" w:themeColor="accent1"/>
           <w:lang w:val="en-US"/>
         </w:rPr>
-        <w:t xml:space="preserve">Site </w:t>
-      </w:r>
-      <w:proofErr w:type="gramStart"/>
+        <w:t xml:space="preserve">Site -  </w:t>
+      </w:r>
       <w:r>
         <w:rPr>
           <w:i/>
@@ -4493,26 +4482,7 @@
           <w:color w:val="4472C4" w:themeColor="accent1"/>
           <w:lang w:val="en-US"/>
         </w:rPr>
-        <w:t xml:space="preserve">-  </w:t>
-      </w:r>
-      <w:r>
-        <w:rPr>
-          <w:i/>
-          <w:iCs/>
-          <w:color w:val="4472C4" w:themeColor="accent1"/>
-          <w:lang w:val="en-US"/>
-        </w:rPr>
-        <w:t>gs.statcounter.com</w:t>
-      </w:r>
-      <w:proofErr w:type="gramEnd"/>
-      <w:r>
-        <w:rPr>
-          <w:i/>
-          <w:iCs/>
-          <w:color w:val="4472C4" w:themeColor="accent1"/>
-          <w:lang w:val="en-US"/>
-        </w:rPr>
-        <w:t>/</w:t>
+        <w:t>gs.statcounter.com/</w:t>
       </w:r>
       <w:proofErr w:type="spellStart"/>
       <w:r>
@@ -4908,70 +4878,284 @@
         <w:jc w:val="both"/>
       </w:pPr>
       <w:r>
-        <w:t xml:space="preserve">Descreva o objetivo de um cronograma no projeto e justifique seu uso, utilizar a tabela do </w:t>
+        <w:t>O cronograma de um projeto tem como objetivo principal estabelecer uma linha do tempo clara para a execução de todas as atividades, permitindo a organização sistemática das tarefas e o cumprimento dos prazos estabelecidos. S</w:t>
+      </w:r>
+      <w:r>
+        <w:t xml:space="preserve">endo usado para  </w:t>
+      </w:r>
+      <w:r>
+        <w:t xml:space="preserve"> justifi</w:t>
+      </w:r>
+      <w:r>
+        <w:t>car a</w:t>
+      </w:r>
+      <w:r>
+        <w:t xml:space="preserve"> necessidade </w:t>
+      </w:r>
+      <w:r>
+        <w:t>de reduzir</w:t>
+      </w:r>
+      <w:r>
+        <w:t xml:space="preserve"> riscos de atraso e garantir que os recursos, tanto humanos quanto técnicos, sejam </w:t>
+      </w:r>
+      <w:r>
+        <w:t>organizados</w:t>
+      </w:r>
+      <w:r>
+        <w:t xml:space="preserve"> de forma eficiente em cada fase do desenvolvimento. No contexto do </w:t>
       </w:r>
       <w:proofErr w:type="spellStart"/>
       <w:r>
-        <w:t>notion</w:t>
+        <w:t>Traffic</w:t>
       </w:r>
       <w:proofErr w:type="spellEnd"/>
       <w:r>
-        <w:t xml:space="preserve">. (lembre-se que o exemplo do </w:t>
+        <w:t xml:space="preserve"> Flow, o cronograma atua como um roteiro que guia a equipe desde a compreensão inicial do problema até a entrega final da solução funcional e documentada.</w:t>
+      </w:r>
+    </w:p>
+    <w:p>
+      <w:pPr>
+        <w:ind w:firstLine="0"/>
+        <w:jc w:val="both"/>
+      </w:pPr>
+    </w:p>
+    <w:p>
+      <w:pPr>
+        <w:ind w:firstLine="0"/>
+        <w:jc w:val="both"/>
+        <w:rPr>
+          <w:b/>
+          <w:bCs/>
+        </w:rPr>
+      </w:pPr>
+      <w:r>
+        <w:rPr>
+          <w:b/>
+          <w:bCs/>
+        </w:rPr>
+        <w:t>7.REPOSITÓRIO GITHUB</w:t>
+      </w:r>
+    </w:p>
+    <w:p>
+      <w:pPr>
+        <w:jc w:val="both"/>
+      </w:pPr>
+      <w:r>
+        <w:t xml:space="preserve">O </w:t>
       </w:r>
       <w:proofErr w:type="spellStart"/>
       <w:r>
-        <w:t>notion</w:t>
+        <w:t>Git</w:t>
       </w:r>
       <w:proofErr w:type="spellEnd"/>
       <w:r>
-        <w:t xml:space="preserve"> pode estar superficial, a ideia é ajudar vocês a desenvolver a documentação, para finalizar, todo o texto é de forma discursiva e com suas palavras).</w:t>
-      </w:r>
-    </w:p>
-    <w:p>
-      <w:pPr>
-        <w:ind w:firstLine="0"/>
-        <w:jc w:val="both"/>
-      </w:pPr>
-    </w:p>
-    <w:p>
-      <w:pPr>
-        <w:ind w:firstLine="0"/>
-        <w:jc w:val="both"/>
-        <w:rPr>
-          <w:b/>
-          <w:bCs/>
-        </w:rPr>
-      </w:pPr>
-      <w:r>
-        <w:rPr>
-          <w:b/>
-          <w:bCs/>
-        </w:rPr>
-        <w:t>7.REPOSITÓRIO GITHUB</w:t>
-      </w:r>
-    </w:p>
-    <w:p>
-      <w:pPr>
-        <w:jc w:val="both"/>
-      </w:pPr>
-      <w:r>
-        <w:t xml:space="preserve">Descreva o que é o </w:t>
+        <w:t xml:space="preserve"> é um sistema de controle de versão distribuído que permite rastrear todas as alterações feitas no código-fonte durante o desenvolvimento, funcionando como uma "máquina do tempo" que possibilita reverter erros e gerenciar diferentes ramificações do projeto. Já o GitHub é a plataforma de hospedagem que utiliza o </w:t>
       </w:r>
       <w:proofErr w:type="spellStart"/>
       <w:r>
-        <w:t>git</w:t>
+        <w:t>Git</w:t>
       </w:r>
       <w:proofErr w:type="spellEnd"/>
       <w:r>
+        <w:t xml:space="preserve"> para centralizar o código na nuvem. A importância dessa combinação para o </w:t>
+      </w:r>
+      <w:proofErr w:type="spellStart"/>
+      <w:r>
+        <w:t>Traffic</w:t>
+      </w:r>
+      <w:proofErr w:type="spellEnd"/>
+      <w:r>
+        <w:t xml:space="preserve"> Flow é vital</w:t>
+      </w:r>
+      <w:r>
+        <w:t>, pois</w:t>
+      </w:r>
+      <w:r>
+        <w:t xml:space="preserve"> garante que o código-fonte esteja sempre atualizado e disponível para todos os membros da equipe em um repositório centralizado. Isso evita a perda de arquivos, facilita o trabalho colaborativo e assegura que a versão final seja sempre a mais estável e revisada, servindo também como o portfólio oficial da solução entregue.</w:t>
+      </w:r>
+    </w:p>
+    <w:p>
+      <w:pPr>
+        <w:ind w:firstLine="0"/>
+        <w:jc w:val="both"/>
+      </w:pPr>
+      <w:r>
+        <w:drawing>
+          <wp:inline distT="0" distB="0" distL="0" distR="0" wp14:anchorId="32B20520" wp14:editId="72780732">
+            <wp:extent cx="5760085" cy="1440180"/>
+            <wp:effectExtent l="0" t="0" r="0" b="7620"/>
+            <wp:docPr id="1156008827" name="Imagem 2"/>
+            <wp:cNvGraphicFramePr>
+              <a:graphicFrameLocks xmlns:a="http://schemas.openxmlformats.org/drawingml/2006/main" noChangeAspect="1"/>
+            </wp:cNvGraphicFramePr>
+            <a:graphic xmlns:a="http://schemas.openxmlformats.org/drawingml/2006/main">
+              <a:graphicData uri="http://schemas.openxmlformats.org/drawingml/2006/picture">
+                <pic:pic xmlns:pic="http://schemas.openxmlformats.org/drawingml/2006/picture">
+                  <pic:nvPicPr>
+                    <pic:cNvPr id="0" name="Picture 6"/>
+                    <pic:cNvPicPr>
+                      <a:picLocks noChangeAspect="1" noChangeArrowheads="1"/>
+                    </pic:cNvPicPr>
+                  </pic:nvPicPr>
+                  <pic:blipFill>
+                    <a:blip r:embed="rId5">
+                      <a:extLst>
+                        <a:ext uri="{28A0092B-C50C-407E-A947-70E740481C1C}">
+                          <a14:useLocalDpi xmlns:a14="http://schemas.microsoft.com/office/drawing/2010/main" val="0"/>
+                        </a:ext>
+                      </a:extLst>
+                    </a:blip>
+                    <a:srcRect/>
+                    <a:stretch>
+                      <a:fillRect/>
+                    </a:stretch>
+                  </pic:blipFill>
+                  <pic:spPr bwMode="auto">
+                    <a:xfrm>
+                      <a:off x="0" y="0"/>
+                      <a:ext cx="5760085" cy="1440180"/>
+                    </a:xfrm>
+                    <a:prstGeom prst="rect">
+                      <a:avLst/>
+                    </a:prstGeom>
+                    <a:noFill/>
+                    <a:ln>
+                      <a:noFill/>
+                    </a:ln>
+                  </pic:spPr>
+                </pic:pic>
+              </a:graphicData>
+            </a:graphic>
+          </wp:inline>
+        </w:drawing>
+      </w:r>
+    </w:p>
+    <w:p>
+      <w:pPr>
+        <w:jc w:val="both"/>
+      </w:pPr>
+    </w:p>
+    <w:p>
+      <w:pPr>
+        <w:ind w:firstLine="0"/>
+        <w:jc w:val="both"/>
+      </w:pPr>
+      <w:r>
+        <w:drawing>
+          <wp:inline distT="0" distB="0" distL="0" distR="0" wp14:anchorId="352D4795" wp14:editId="251FE5F0">
+            <wp:extent cx="3296110" cy="2057687"/>
+            <wp:effectExtent l="0" t="0" r="0" b="0"/>
+            <wp:docPr id="870045924" name="Imagem 1"/>
+            <wp:cNvGraphicFramePr>
+              <a:graphicFrameLocks xmlns:a="http://schemas.openxmlformats.org/drawingml/2006/main" noChangeAspect="1"/>
+            </wp:cNvGraphicFramePr>
+            <a:graphic xmlns:a="http://schemas.openxmlformats.org/drawingml/2006/main">
+              <a:graphicData uri="http://schemas.openxmlformats.org/drawingml/2006/picture">
+                <pic:pic xmlns:pic="http://schemas.openxmlformats.org/drawingml/2006/picture">
+                  <pic:nvPicPr>
+                    <pic:cNvPr id="870045924" name=""/>
+                    <pic:cNvPicPr/>
+                  </pic:nvPicPr>
+                  <pic:blipFill>
+                    <a:blip r:embed="rId6"/>
+                    <a:stretch>
+                      <a:fillRect/>
+                    </a:stretch>
+                  </pic:blipFill>
+                  <pic:spPr>
+                    <a:xfrm>
+                      <a:off x="0" y="0"/>
+                      <a:ext cx="3296110" cy="2057687"/>
+                    </a:xfrm>
+                    <a:prstGeom prst="rect">
+                      <a:avLst/>
+                    </a:prstGeom>
+                  </pic:spPr>
+                </pic:pic>
+              </a:graphicData>
+            </a:graphic>
+          </wp:inline>
+        </w:drawing>
+      </w:r>
+    </w:p>
+    <w:p>
+      <w:pPr>
+        <w:ind w:firstLine="0"/>
+        <w:jc w:val="both"/>
+      </w:pPr>
+    </w:p>
+    <w:p>
+      <w:pPr>
+        <w:jc w:val="both"/>
+      </w:pPr>
+    </w:p>
+    <w:p>
+      <w:pPr>
+        <w:ind w:firstLine="0"/>
+        <w:jc w:val="both"/>
+      </w:pPr>
+    </w:p>
+    <w:p>
+      <w:pPr>
+        <w:ind w:firstLine="0"/>
+        <w:jc w:val="both"/>
+        <w:rPr>
+          <w:b/>
+          <w:bCs/>
+        </w:rPr>
+      </w:pPr>
+      <w:r>
+        <w:rPr>
+          <w:b/>
+          <w:bCs/>
+        </w:rPr>
+        <w:t>8.REFERÊNCIAS BIBLIOGRÁFICAS</w:t>
+      </w:r>
+    </w:p>
+    <w:p>
+      <w:pPr>
+        <w:ind w:firstLine="0"/>
+        <w:jc w:val="both"/>
+      </w:pPr>
+      <w:r>
+        <w:t xml:space="preserve">(apague o que está entre parênteses quando colocar no github, todo livro ou link utilizado colocar nas referências, é em ordem alfabética, os dois itens abaixo são documentos apresentados a vocês, plano de ensino do semestre e o guia) </w:t>
+      </w:r>
+    </w:p>
+    <w:p>
+      <w:pPr>
+        <w:ind w:firstLine="0"/>
+        <w:jc w:val="both"/>
+      </w:pPr>
+    </w:p>
+    <w:p>
+      <w:pPr>
+        <w:ind w:firstLine="0"/>
+        <w:jc w:val="both"/>
+      </w:pPr>
+      <w:r>
+        <w:t>SERVIÇO NACIONAL DE APRENDIZAGEM INDUSTRIAL.</w:t>
+      </w:r>
+      <w:r>
         <w:t xml:space="preserve"> </w:t>
       </w:r>
-      <w:proofErr w:type="gramStart"/>
-      <w:r>
-        <w:t>e  github</w:t>
-      </w:r>
-      <w:proofErr w:type="gramEnd"/>
-      <w:r>
-        <w:t>, sua importância para o projeto (uma delas é o arquivo do código fonte centralizado e sempre com a versão atual), encontre uma forma de reproduzir a estrutura do projeto (imagem?) e coloque a estrutura do README.md (imagem ou tópicos)</w:t>
+      <w:r>
+        <w:rPr>
+          <w:b/>
+          <w:bCs/>
+        </w:rPr>
+        <w:t>Plano de Ensino — Módulo Básico: Técnico em Desenvolvimento de Sistemas</w:t>
+      </w:r>
+      <w:r>
+        <w:t xml:space="preserve">. </w:t>
+      </w:r>
+      <w:r>
+        <w:t>Sertãozinho</w:t>
+      </w:r>
+      <w:r>
+        <w:t>: SENAI-SP, 202</w:t>
+      </w:r>
+      <w:r>
+        <w:t>6</w:t>
       </w:r>
       <w:r>
         <w:t>.</w:t>
@@ -4987,78 +5171,6 @@
       <w:pPr>
         <w:ind w:firstLine="0"/>
         <w:jc w:val="both"/>
-        <w:rPr>
-          <w:b/>
-          <w:bCs/>
-        </w:rPr>
-      </w:pPr>
-      <w:r>
-        <w:rPr>
-          <w:b/>
-          <w:bCs/>
-        </w:rPr>
-        <w:t>8.REFERÊNCIAS BIBLIOGRÁFICAS</w:t>
-      </w:r>
-    </w:p>
-    <w:p>
-      <w:pPr>
-        <w:ind w:firstLine="0"/>
-        <w:jc w:val="both"/>
-      </w:pPr>
-      <w:r>
-        <w:t xml:space="preserve">(apague o que está entre parênteses quando colocar no github, todo livro ou link utilizado colocar nas referências, é em ordem alfabética, os dois itens abaixo são documentos apresentados a vocês, plano de ensino do semestre e o guia) </w:t>
-      </w:r>
-    </w:p>
-    <w:p>
-      <w:pPr>
-        <w:ind w:firstLine="0"/>
-        <w:jc w:val="both"/>
-      </w:pPr>
-    </w:p>
-    <w:p>
-      <w:pPr>
-        <w:ind w:firstLine="0"/>
-        <w:jc w:val="both"/>
-      </w:pPr>
-      <w:r>
-        <w:t>SERVIÇO NACIONAL DE APRENDIZAGEM INDUSTRIAL.</w:t>
-      </w:r>
-      <w:r>
-        <w:t xml:space="preserve"> </w:t>
-      </w:r>
-      <w:r>
-        <w:rPr>
-          <w:b/>
-          <w:bCs/>
-        </w:rPr>
-        <w:t>Plano de Ensino — Módulo Básico: Técnico em Desenvolvimento de Sistemas</w:t>
-      </w:r>
-      <w:r>
-        <w:t xml:space="preserve">. </w:t>
-      </w:r>
-      <w:r>
-        <w:t>Sertãozinho</w:t>
-      </w:r>
-      <w:r>
-        <w:t>: SENAI-SP, 202</w:t>
-      </w:r>
-      <w:r>
-        <w:t>6</w:t>
-      </w:r>
-      <w:r>
-        <w:t>.</w:t>
-      </w:r>
-    </w:p>
-    <w:p>
-      <w:pPr>
-        <w:ind w:firstLine="0"/>
-        <w:jc w:val="both"/>
-      </w:pPr>
-    </w:p>
-    <w:p>
-      <w:pPr>
-        <w:ind w:firstLine="0"/>
-        <w:jc w:val="both"/>
       </w:pPr>
       <w:r>
         <w:t xml:space="preserve">SERVIÇO NACIONAL DE APRENDIZAGEM INDUSTRIAL. </w:t>
@@ -5079,18 +5191,6 @@
         <w:ind w:firstLine="0"/>
         <w:jc w:val="both"/>
       </w:pPr>
-    </w:p>
-    <w:p>
-      <w:pPr>
-        <w:ind w:firstLine="0"/>
-        <w:jc w:val="both"/>
-        <w:rPr>
-          <w:u w:val="single"/>
-        </w:rPr>
-      </w:pPr>
-      <w:r>
-        <w:t>testandoooooooooooooooooooooooooooooooooooooooooooo</w:t>
-      </w:r>
     </w:p>
     <w:p>
       <w:pPr>
@@ -6531,7 +6631,6 @@
   <w:style w:type="character" w:default="1" w:styleId="Fontepargpadro">
     <w:name w:val="Default Paragraph Font"/>
     <w:uiPriority w:val="1"/>
-    <w:semiHidden/>
     <w:unhideWhenUsed/>
   </w:style>
   <w:style w:type="table" w:default="1" w:styleId="Tabelanormal">

</xml_diff>

<commit_message>
fix:versionamento após realização da sprint 2,3,4
</commit_message>
<xml_diff>
--- a/docs/documento-semaforo-maria-laura.docx
+++ b/docs/documento-semaforo-maria-laura.docx
@@ -270,6 +270,7 @@
         </w:rPr>
         <w:t xml:space="preserve"> </w:t>
       </w:r>
+      <w:proofErr w:type="gramStart"/>
       <w:r>
         <w:rPr>
           <w:rFonts w:cs="Arial"/>
@@ -294,6 +295,7 @@
         </w:rPr>
         <w:t>.</w:t>
       </w:r>
+      <w:proofErr w:type="gramEnd"/>
       <w:r>
         <w:rPr>
           <w:rFonts w:cs="Arial"/>
@@ -3095,7 +3097,15 @@
         <w:t>No campo da segurança e lógica de tráfego, os requisitos funcionais estabelecem regras rígidas</w:t>
       </w:r>
       <w:r>
-        <w:t xml:space="preserve"> como : </w:t>
+        <w:t xml:space="preserve"> </w:t>
+      </w:r>
+      <w:proofErr w:type="gramStart"/>
+      <w:r>
+        <w:t>como :</w:t>
+      </w:r>
+      <w:proofErr w:type="gramEnd"/>
+      <w:r>
+        <w:t xml:space="preserve"> </w:t>
       </w:r>
       <w:r>
         <w:t>o sistema deve obrigatoriamente impedir que as duas vias fiquem verdes simultaneamente, evitando qualquer risco de colisão. Complementando essa segurança, o software deve processar tempos de permanência distintos para priorizar a via principal e executar intervalos de segurança onde ambos os sinais permaneçam no vermelho durante a transição de fluxo, garantindo que o cruzamento esteja vazio antes de cada liberação</w:t>
@@ -4241,17 +4251,7 @@
         <w:jc w:val="both"/>
       </w:pPr>
       <w:r>
-        <w:t xml:space="preserve">A escolha da </w:t>
-      </w:r>
-      <w:r>
-        <w:rPr>
-          <w:b/>
-          <w:bCs/>
-        </w:rPr>
-        <w:t>Linguagem C</w:t>
-      </w:r>
-      <w:r>
-        <w:t xml:space="preserve"> para o desenvolvime</w:t>
+        <w:t>A escolha da Linguagem C para o desenvolvime</w:t>
       </w:r>
       <w:r>
         <w:t>nto do</w:t>
@@ -4261,22 +4261,11 @@
       </w:r>
       <w:proofErr w:type="spellStart"/>
       <w:r>
-        <w:rPr>
-          <w:b/>
-          <w:bCs/>
-        </w:rPr>
         <w:t>Traffic</w:t>
       </w:r>
       <w:proofErr w:type="spellEnd"/>
       <w:r>
-        <w:rPr>
-          <w:b/>
-          <w:bCs/>
-        </w:rPr>
-        <w:t xml:space="preserve"> Flow</w:t>
-      </w:r>
-      <w:r>
-        <w:t xml:space="preserve"> fundamenta-se em sua eficiência histórica e técnica no controle de sistemas que exigem alta precisão e baixo consumo de recursos. Segundo a literatura especializada em arquitetura de computadores e sistemas operacionais, o C é classificado como uma linguagem de "médio nível", pois oferece a abstração necessária para a lógica de programação moderna ao mesmo tempo em que permite um controle direto sobre o hardware e o gerenciamento de memória. </w:t>
+        <w:t xml:space="preserve"> Flow fundamenta-se em sua eficiência histórica e técnica no controle de sistemas que exigem alta precisão e baixo consumo de recursos. Segundo a literatura especializada em arquitetura de computadores e sistemas operacionais, o C é classificado como uma linguagem de "médio nível", pois oferece a abstração necessária para a lógica de programação moderna ao mesmo tempo em que permite um controle direto sobre o hardware e o gerenciamento de memória. </w:t>
       </w:r>
     </w:p>
     <w:p>
@@ -4473,8 +4462,9 @@
           <w:color w:val="4472C4" w:themeColor="accent1"/>
           <w:lang w:val="en-US"/>
         </w:rPr>
-        <w:t xml:space="preserve">Site -  </w:t>
-      </w:r>
+        <w:t xml:space="preserve">Site </w:t>
+      </w:r>
+      <w:proofErr w:type="gramStart"/>
       <w:r>
         <w:rPr>
           <w:i/>
@@ -4482,7 +4472,26 @@
           <w:color w:val="4472C4" w:themeColor="accent1"/>
           <w:lang w:val="en-US"/>
         </w:rPr>
-        <w:t>gs.statcounter.com/</w:t>
+        <w:t xml:space="preserve">-  </w:t>
+      </w:r>
+      <w:r>
+        <w:rPr>
+          <w:i/>
+          <w:iCs/>
+          <w:color w:val="4472C4" w:themeColor="accent1"/>
+          <w:lang w:val="en-US"/>
+        </w:rPr>
+        <w:t>gs.statcounter.com</w:t>
+      </w:r>
+      <w:proofErr w:type="gramEnd"/>
+      <w:r>
+        <w:rPr>
+          <w:i/>
+          <w:iCs/>
+          <w:color w:val="4472C4" w:themeColor="accent1"/>
+          <w:lang w:val="en-US"/>
+        </w:rPr>
+        <w:t>/</w:t>
       </w:r>
       <w:proofErr w:type="spellStart"/>
       <w:r>
@@ -4980,6 +4989,9 @@
         <w:jc w:val="both"/>
       </w:pPr>
       <w:r>
+        <w:rPr>
+          <w:noProof/>
+        </w:rPr>
         <w:drawing>
           <wp:inline distT="0" distB="0" distL="0" distR="0" wp14:anchorId="32B20520" wp14:editId="72780732">
             <wp:extent cx="5760085" cy="1440180"/>
@@ -5041,6 +5053,9 @@
         <w:jc w:val="both"/>
       </w:pPr>
       <w:r>
+        <w:rPr>
+          <w:noProof/>
+        </w:rPr>
         <w:drawing>
           <wp:inline distT="0" distB="0" distL="0" distR="0" wp14:anchorId="352D4795" wp14:editId="251FE5F0">
             <wp:extent cx="3296110" cy="2057687"/>
@@ -6631,6 +6646,7 @@
   <w:style w:type="character" w:default="1" w:styleId="Fontepargpadro">
     <w:name w:val="Default Paragraph Font"/>
     <w:uiPriority w:val="1"/>
+    <w:semiHidden/>
     <w:unhideWhenUsed/>
   </w:style>
   <w:style w:type="table" w:default="1" w:styleId="Tabelanormal">

</xml_diff>